<commit_message>
Add pediatric hem/onc bedside experience to Hoag CRC resume
Fever and neutropenia presentations, oncology code events, and sterile
port-access preparation from the CHOC ED role, per the candidate.

Co-Authored-By: Claude Fable 5 <noreply@anthropic.com>
Claude-Session: https://claude.ai/code/session_0169jAMuBb2MVYdrJVQdr8P2
</commit_message>
<xml_diff>
--- a/tailored/ODonnell_Andrew_Resume_Hoag_CRC.docx
+++ b/tailored/ODonnell_Andrew_Resume_Hoag_CRC.docx
@@ -62,7 +62,7 @@
           <w:sz w:val="21"/>
           <w:szCs w:val="21"/>
         </w:rPr>
-        <w:t xml:space="preserve">Clinical Research Coordinator with 8+ years of experience across Stanford University School of Medicine, the U.S. Air Force, and a Level I trauma center. Coordinated concurrent NIH and industry clinical trials (Phase II-IV) for 1,500+ participants, with direct experience in informed consent, eligibility screening, study visits, safety reporting with CTCAE grading, and EDC data management under ICH GCP and 21 CFR. Licensed CPT-I phlebotomist with DOT specimen shipping certification and hands-on emergency department experience supporting acute patient events. ACRP-Certified Project Manager and Certified Professional.</w:t>
+        <w:t xml:space="preserve">Clinical Research Coordinator with 8+ years of experience across Stanford University School of Medicine, the U.S. Air Force, and a Level I trauma center. Coordinated concurrent NIH and industry clinical trials (Phase II-IV) for 1,500+ participants, with direct experience in informed consent, eligibility screening, study visits, safety reporting with CTCAE grading, and EDC data management under ICH GCP and 21 CFR. Licensed CPT-I phlebotomist with DOT specimen shipping certification and bedside emergency department experience caring for pediatric hematology and oncology patients. ACRP-Certified Project Manager and Certified Professional.</w:t>
       </w:r>
     </w:p>
     <w:p>
@@ -96,7 +96,7 @@
           <w:sz w:val="21"/>
           <w:szCs w:val="21"/>
         </w:rPr>
-        <w:t xml:space="preserve">Informed Consent &amp; eConsent | Eligibility Screening &amp; Enrollment | Patient Recruitment &amp; Retention | Study Visit Coordination (Onsite &amp; Decentralized) | AE/SAE Reporting &amp; CTCAE Grading | Phlebotomy (CPT-I Licensed) | DOT-Certified Specimen Shipping | Investigational Product Shipments | Protocol Compliance (ICH GCP, 21 CFR, HIPAA) | EDC &amp; Data Quality | Sponsor &amp; CRO Relations | Staff Training &amp; Preceptorship</w:t>
+        <w:t xml:space="preserve">Informed Consent &amp; eConsent | Eligibility Screening &amp; Enrollment | Patient Recruitment &amp; Retention | Study Visit Coordination (Onsite &amp; Decentralized) | AE/SAE Reporting &amp; CTCAE Grading | Pediatric Hematology/Oncology Patient Care | Sterile Technique &amp; Port Access Preparation | Phlebotomy (CPT-I Licensed) | DOT-Certified Specimen Shipping | Investigational Product Shipments | Protocol Compliance (ICH GCP, 21 CFR, HIPAA) | EDC &amp; Data Quality | Sponsor &amp; CRO Relations | Staff Training &amp; Preceptorship</w:t>
       </w:r>
     </w:p>
     <w:p>
@@ -488,6 +488,26 @@
           <w:szCs w:val="21"/>
         </w:rPr>
         <w:t xml:space="preserve">Delivered frontline care in a top-ranked Level I pediatric trauma center, assisting in triage, stabilization, and 20K+ annual emergency encounters.</w:t>
+      </w:r>
+    </w:p>
+    <w:p>
+      <w:pPr>
+        <w:pStyle w:val="ListParagraph"/>
+        <w:numPr>
+          <w:ilvl w:val="0"/>
+          <w:numId w:val="2"/>
+        </w:numPr>
+        <w:spacing w:after="30"/>
+      </w:pPr>
+      <w:r>
+        <w:rPr>
+          <w:rFonts w:ascii="Calibri" w:cs="Calibri" w:eastAsia="Calibri" w:hAnsi="Calibri"/>
+          <w:b w:val="false"/>
+          <w:bCs w:val="false"/>
+          <w:sz w:val="21"/>
+          <w:szCs w:val="21"/>
+        </w:rPr>
+        <w:t xml:space="preserve">Provided bedside care for pediatric hematology and oncology patients, including fever and neutropenia presentations and oncology code events; prepared sterile fields and supplies for implanted port access.</w:t>
       </w:r>
     </w:p>
     <w:p>

</xml_diff>

<commit_message>
Make job header date ranges unbreakable so years are never orphaned
Non-breaking spaces (and non-breaking hyphens in docx) in the trailing
date segment force the whole range to wrap as one unit. Applied to both
renderers, regenerated both tailored resumes, rule added to CLAUDE.md.

Co-Authored-By: Claude Fable 5 <noreply@anthropic.com>
Claude-Session: https://claude.ai/code/session_0169jAMuBb2MVYdrJVQdr8P2
</commit_message>
<xml_diff>
--- a/tailored/ODonnell_Andrew_Resume_Hoag_CRC.docx
+++ b/tailored/ODonnell_Andrew_Resume_Hoag_CRC.docx
@@ -235,7 +235,7 @@
           <w:sz w:val="21"/>
           <w:szCs w:val="21"/>
         </w:rPr>
-        <w:t xml:space="preserve"> | Stanford University Department of Medicine, Palo Alto, CA | Nov 2021 - Feb 2026</w:t>
+        <w:t xml:space="preserve"> | Stanford University Department of Medicine, Palo Alto, CA | Nov 2021 ‑ Feb 2026</w:t>
       </w:r>
     </w:p>
     <w:p>
@@ -381,7 +381,7 @@
           <w:sz w:val="21"/>
           <w:szCs w:val="21"/>
         </w:rPr>
-        <w:t xml:space="preserve"> | International SOS (Iqarus), Fort Lee, VA | Aug 2021 - Sep 2021</w:t>
+        <w:t xml:space="preserve"> | International SOS (Iqarus), Fort Lee, VA | Aug 2021 ‑ Sep 2021</w:t>
       </w:r>
     </w:p>
     <w:p>
@@ -467,7 +467,7 @@
           <w:sz w:val="21"/>
           <w:szCs w:val="21"/>
         </w:rPr>
-        <w:t xml:space="preserve"> | RCET | Children's Hospital of Orange County, Santa Ana, CA | Jan 2018 - Oct 2021</w:t>
+        <w:t xml:space="preserve"> | RCET | Children's Hospital of Orange County, Santa Ana, CA | Jan 2018 ‑ Oct 2021</w:t>
       </w:r>
     </w:p>
     <w:p>
@@ -593,7 +593,7 @@
           <w:sz w:val="21"/>
           <w:szCs w:val="21"/>
         </w:rPr>
-        <w:t xml:space="preserve"> | 4A2x5 | U.S. Air Force, Various Locations | Sep 2017 - Sep 2025, ADT - Reserve</w:t>
+        <w:t xml:space="preserve"> | 4A2x5 | U.S. Air Force, Various Locations | Sep 2017 ‑ Sep 2025, ADT ‑ Reserve</w:t>
       </w:r>
     </w:p>
     <w:p>

</xml_diff>

<commit_message>
Match master formatting: left-aligned text, one-line job headers, clean bar wrapping
Body text is left-aligned (justification stretched the pipe separators),
pipes bind to the preceding word so they never start a line, and job
headers auto-shrink to always fit on a single line.

Co-Authored-By: Claude Fable 5 <noreply@anthropic.com>
Claude-Session: https://claude.ai/code/session_0169jAMuBb2MVYdrJVQdr8P2
</commit_message>
<xml_diff>
--- a/tailored/ODonnell_Andrew_Resume_Hoag_CRC.docx
+++ b/tailored/ODonnell_Andrew_Resume_Hoag_CRC.docx
@@ -31,7 +31,7 @@
           <w:sz w:val="19"/>
           <w:szCs w:val="19"/>
         </w:rPr>
-        <w:t xml:space="preserve">Los Angeles, CA | aodhan.o@outlook.com | 650.213.2381 | linkedin.com/in/andrewdavidodonnell/</w:t>
+        <w:t xml:space="preserve">Los Angeles, CA | aodhan.o@outlook.com | 650.213.2381 | linkedin.com/in/andrewdavidodonnell/</w:t>
       </w:r>
     </w:p>
     <w:p>
@@ -96,7 +96,7 @@
           <w:sz w:val="21"/>
           <w:szCs w:val="21"/>
         </w:rPr>
-        <w:t xml:space="preserve">Informed Consent &amp; eConsent | Eligibility Screening &amp; Enrollment | Patient Recruitment &amp; Retention | Study Visit Coordination (Onsite &amp; Decentralized) | AE/SAE Reporting &amp; CTCAE Grading | Pediatric Hematology/Oncology Patient Care | Sterile Technique &amp; Port Access Preparation | Phlebotomy (CPT-I Licensed) | DOT-Certified Specimen Shipping | Investigational Product Shipments | Protocol Compliance (ICH GCP, 21 CFR, HIPAA) | EDC &amp; Data Quality | Sponsor &amp; CRO Relations | Staff Training &amp; Preceptorship</w:t>
+        <w:t xml:space="preserve">Informed Consent &amp; eConsent | Eligibility Screening &amp; Enrollment | Patient Recruitment &amp; Retention | Study Visit Coordination (Onsite &amp; Decentralized) | AE/SAE Reporting &amp; CTCAE Grading | Pediatric Hematology/Oncology Patient Care | Sterile Technique &amp; Port Access Preparation | Phlebotomy (CPT-I Licensed) | DOT-Certified Specimen Shipping | Investigational Product Shipments | Protocol Compliance (ICH GCP, 21 CFR, HIPAA) | EDC &amp; Data Quality | Sponsor &amp; CRO Relations | Staff Training &amp; Preceptorship</w:t>
       </w:r>
     </w:p>
     <w:p>
@@ -140,7 +140,7 @@
           <w:sz w:val="21"/>
           <w:szCs w:val="21"/>
         </w:rPr>
-        <w:t xml:space="preserve"> CTMS - OnCore, Oracle Siebel | EDC - Medidata Rave, REDCap | eTMF | eConsent | ePRO/eCOA | Epic | IRT | Cerner | Safety Reporting - AE/SAE, CTCAE</w:t>
+        <w:t xml:space="preserve"> CTMS - OnCore, Oracle Siebel | EDC - Medidata Rave, REDCap | eTMF | eConsent | ePRO/eCOA | Epic | IRT | Cerner | Safety Reporting - AE/SAE, CTCAE</w:t>
       </w:r>
     </w:p>
     <w:p>
@@ -165,7 +165,7 @@
           <w:sz w:val="21"/>
           <w:szCs w:val="21"/>
         </w:rPr>
-        <w:t xml:space="preserve"> SAS | SPSS | R | Python | Excel (Advanced Functions) | Smartsheet</w:t>
+        <w:t xml:space="preserve"> SAS | SPSS | R | Python | Excel (Advanced Functions) | Smartsheet</w:t>
       </w:r>
     </w:p>
     <w:p>
@@ -190,7 +190,7 @@
           <w:sz w:val="21"/>
           <w:szCs w:val="21"/>
         </w:rPr>
-        <w:t xml:space="preserve"> Microsoft Office Suite | Teams | Zoom | Slack | Adobe Acrobat Sign | SharePoint | Box | DocuSign | Jira | Confluence | Google Workspace</w:t>
+        <w:t xml:space="preserve"> Microsoft Office Suite | Teams | Zoom | Slack | Adobe Acrobat Sign | SharePoint | Box | DocuSign | Jira | Confluence | Google Workspace</w:t>
       </w:r>
     </w:p>
     <w:p>
@@ -222,8 +222,8 @@
           <w:rFonts w:ascii="Calibri" w:cs="Calibri" w:eastAsia="Calibri" w:hAnsi="Calibri"/>
           <w:b/>
           <w:bCs/>
-          <w:sz w:val="21"/>
-          <w:szCs w:val="21"/>
+          <w:sz w:val="19"/>
+          <w:szCs w:val="19"/>
         </w:rPr>
         <w:t xml:space="preserve">Clinical Research Coordinator Associate</w:t>
       </w:r>
@@ -232,10 +232,10 @@
           <w:rFonts w:ascii="Calibri" w:cs="Calibri" w:eastAsia="Calibri" w:hAnsi="Calibri"/>
           <w:b w:val="false"/>
           <w:bCs w:val="false"/>
-          <w:sz w:val="21"/>
-          <w:szCs w:val="21"/>
-        </w:rPr>
-        <w:t xml:space="preserve"> | Stanford University Department of Medicine, Palo Alto, CA | Nov 2021 ‑ Feb 2026</w:t>
+          <w:sz w:val="19"/>
+          <w:szCs w:val="19"/>
+        </w:rPr>
+        <w:t xml:space="preserve"> | Stanford University Department of Medicine, Palo Alto, CA | Nov 2021 ‑ Feb 2026</w:t>
       </w:r>
     </w:p>
     <w:p>
@@ -368,8 +368,8 @@
           <w:rFonts w:ascii="Calibri" w:cs="Calibri" w:eastAsia="Calibri" w:hAnsi="Calibri"/>
           <w:b/>
           <w:bCs/>
-          <w:sz w:val="21"/>
-          <w:szCs w:val="21"/>
+          <w:sz w:val="19"/>
+          <w:szCs w:val="19"/>
         </w:rPr>
         <w:t xml:space="preserve">Technical Operations Manager (Contract)</w:t>
       </w:r>
@@ -378,10 +378,10 @@
           <w:rFonts w:ascii="Calibri" w:cs="Calibri" w:eastAsia="Calibri" w:hAnsi="Calibri"/>
           <w:b w:val="false"/>
           <w:bCs w:val="false"/>
-          <w:sz w:val="21"/>
-          <w:szCs w:val="21"/>
-        </w:rPr>
-        <w:t xml:space="preserve"> | International SOS (Iqarus), Fort Lee, VA | Aug 2021 ‑ Sep 2021</w:t>
+          <w:sz w:val="19"/>
+          <w:szCs w:val="19"/>
+        </w:rPr>
+        <w:t xml:space="preserve"> | International SOS (Iqarus), Fort Lee, VA | Aug 2021 ‑ Sep 2021</w:t>
       </w:r>
     </w:p>
     <w:p>
@@ -454,8 +454,8 @@
           <w:rFonts w:ascii="Calibri" w:cs="Calibri" w:eastAsia="Calibri" w:hAnsi="Calibri"/>
           <w:b/>
           <w:bCs/>
-          <w:sz w:val="21"/>
-          <w:szCs w:val="21"/>
+          <w:sz w:val="19"/>
+          <w:szCs w:val="19"/>
         </w:rPr>
         <w:t xml:space="preserve">Emergency Department Technician</w:t>
       </w:r>
@@ -464,10 +464,10 @@
           <w:rFonts w:ascii="Calibri" w:cs="Calibri" w:eastAsia="Calibri" w:hAnsi="Calibri"/>
           <w:b w:val="false"/>
           <w:bCs w:val="false"/>
-          <w:sz w:val="21"/>
-          <w:szCs w:val="21"/>
-        </w:rPr>
-        <w:t xml:space="preserve"> | RCET | Children's Hospital of Orange County, Santa Ana, CA | Jan 2018 ‑ Oct 2021</w:t>
+          <w:sz w:val="19"/>
+          <w:szCs w:val="19"/>
+        </w:rPr>
+        <w:t xml:space="preserve"> | RCET | Children's Hospital of Orange County, Santa Ana, CA | Jan 2018 ‑ Oct 2021</w:t>
       </w:r>
     </w:p>
     <w:p>
@@ -580,8 +580,8 @@
           <w:rFonts w:ascii="Calibri" w:cs="Calibri" w:eastAsia="Calibri" w:hAnsi="Calibri"/>
           <w:b/>
           <w:bCs/>
-          <w:sz w:val="21"/>
-          <w:szCs w:val="21"/>
+          <w:sz w:val="19"/>
+          <w:szCs w:val="19"/>
         </w:rPr>
         <w:t xml:space="preserve">Healthcare Technology Manager</w:t>
       </w:r>
@@ -590,10 +590,10 @@
           <w:rFonts w:ascii="Calibri" w:cs="Calibri" w:eastAsia="Calibri" w:hAnsi="Calibri"/>
           <w:b w:val="false"/>
           <w:bCs w:val="false"/>
-          <w:sz w:val="21"/>
-          <w:szCs w:val="21"/>
-        </w:rPr>
-        <w:t xml:space="preserve"> | 4A2x5 | U.S. Air Force, Various Locations | Sep 2017 ‑ Sep 2025, ADT ‑ Reserve</w:t>
+          <w:sz w:val="19"/>
+          <w:szCs w:val="19"/>
+        </w:rPr>
+        <w:t xml:space="preserve"> | 4A2x5 | U.S. Air Force, Various Locations | Sep 2017 ‑ Sep 2025, ADT ‑ Reserve</w:t>
       </w:r>
     </w:p>
     <w:p>
@@ -712,47 +712,47 @@
           <w:sz w:val="21"/>
           <w:szCs w:val="21"/>
         </w:rPr>
-        <w:t xml:space="preserve">CPT I Phlebotomy Registry No. CPT 02270029 | NREMT Registry No. E3767060 | American Heart Association BLS, ACLS, PALS</w:t>
-      </w:r>
-    </w:p>
-    <w:p>
-      <w:pPr>
-        <w:pStyle w:val="ListParagraph"/>
-        <w:numPr>
-          <w:ilvl w:val="0"/>
-          <w:numId w:val="2"/>
-        </w:numPr>
-        <w:spacing w:after="30"/>
-      </w:pPr>
-      <w:r>
-        <w:rPr>
-          <w:rFonts w:ascii="Calibri" w:cs="Calibri" w:eastAsia="Calibri" w:hAnsi="Calibri"/>
-          <w:b w:val="false"/>
-          <w:bCs w:val="false"/>
-          <w:sz w:val="21"/>
-          <w:szCs w:val="21"/>
-        </w:rPr>
-        <w:t xml:space="preserve">CITI Good Clinical Practice (GCP) | HIPAA | Aerosol Transmissible Diseases | DOT Shipping</w:t>
-      </w:r>
-    </w:p>
-    <w:p>
-      <w:pPr>
-        <w:pStyle w:val="ListParagraph"/>
-        <w:numPr>
-          <w:ilvl w:val="0"/>
-          <w:numId w:val="2"/>
-        </w:numPr>
-        <w:spacing w:after="30"/>
-      </w:pPr>
-      <w:r>
-        <w:rPr>
-          <w:rFonts w:ascii="Calibri" w:cs="Calibri" w:eastAsia="Calibri" w:hAnsi="Calibri"/>
-          <w:b w:val="false"/>
-          <w:bCs w:val="false"/>
-          <w:sz w:val="21"/>
-          <w:szCs w:val="21"/>
-        </w:rPr>
-        <w:t xml:space="preserve">Pre-Hospital Trauma Life Support (PHTLS) | Tactical Combat Casualty Care Level II (TCCC)</w:t>
+        <w:t xml:space="preserve">CPT I Phlebotomy Registry No. CPT 02270029 | NREMT Registry No. E3767060 | American Heart Association BLS, ACLS, PALS</w:t>
+      </w:r>
+    </w:p>
+    <w:p>
+      <w:pPr>
+        <w:pStyle w:val="ListParagraph"/>
+        <w:numPr>
+          <w:ilvl w:val="0"/>
+          <w:numId w:val="2"/>
+        </w:numPr>
+        <w:spacing w:after="30"/>
+      </w:pPr>
+      <w:r>
+        <w:rPr>
+          <w:rFonts w:ascii="Calibri" w:cs="Calibri" w:eastAsia="Calibri" w:hAnsi="Calibri"/>
+          <w:b w:val="false"/>
+          <w:bCs w:val="false"/>
+          <w:sz w:val="21"/>
+          <w:szCs w:val="21"/>
+        </w:rPr>
+        <w:t xml:space="preserve">CITI Good Clinical Practice (GCP) | HIPAA | Aerosol Transmissible Diseases | DOT Shipping</w:t>
+      </w:r>
+    </w:p>
+    <w:p>
+      <w:pPr>
+        <w:pStyle w:val="ListParagraph"/>
+        <w:numPr>
+          <w:ilvl w:val="0"/>
+          <w:numId w:val="2"/>
+        </w:numPr>
+        <w:spacing w:after="30"/>
+      </w:pPr>
+      <w:r>
+        <w:rPr>
+          <w:rFonts w:ascii="Calibri" w:cs="Calibri" w:eastAsia="Calibri" w:hAnsi="Calibri"/>
+          <w:b w:val="false"/>
+          <w:bCs w:val="false"/>
+          <w:sz w:val="21"/>
+          <w:szCs w:val="21"/>
+        </w:rPr>
+        <w:t xml:space="preserve">Pre-Hospital Trauma Life Support (PHTLS) | Tactical Combat Casualty Care Level II (TCCC)</w:t>
       </w:r>
     </w:p>
     <w:p>
@@ -792,7 +792,7 @@
           <w:sz w:val="21"/>
           <w:szCs w:val="21"/>
         </w:rPr>
-        <w:t xml:space="preserve">Stanford Online AI in Healthcare | Google Advanced Data Analytics | Interprofessional Healthcare Informatics</w:t>
+        <w:t xml:space="preserve">Stanford Online AI in Healthcare | Google Advanced Data Analytics | Interprofessional Healthcare Informatics</w:t>
       </w:r>
     </w:p>
     <w:p>
@@ -935,7 +935,7 @@
           <w:sz w:val="21"/>
           <w:szCs w:val="21"/>
         </w:rPr>
-        <w:t xml:space="preserve"> | Chapman University, Orange, CA</w:t>
+        <w:t xml:space="preserve"> | Chapman University, Orange, CA</w:t>
       </w:r>
     </w:p>
     <w:p>
@@ -950,7 +950,7 @@
           <w:sz w:val="21"/>
           <w:szCs w:val="21"/>
         </w:rPr>
-        <w:t xml:space="preserve">Graduate Fellowship Award (2x) | Sigma Iota Rho Honor Society</w:t>
+        <w:t xml:space="preserve">Graduate Fellowship Award (2x) | Sigma Iota Rho Honor Society</w:t>
       </w:r>
     </w:p>
     <w:p>
@@ -975,7 +975,7 @@
           <w:sz w:val="21"/>
           <w:szCs w:val="21"/>
         </w:rPr>
-        <w:t xml:space="preserve"> | California State University Long Beach, Long Beach, CA</w:t>
+        <w:t xml:space="preserve"> | California State University Long Beach, Long Beach, CA</w:t>
       </w:r>
     </w:p>
     <w:p>
@@ -1015,12 +1015,12 @@
           <w:sz w:val="21"/>
           <w:szCs w:val="21"/>
         </w:rPr>
-        <w:t xml:space="preserve"> | UCLA Extension, Los Angeles, CA</w:t>
+        <w:t xml:space="preserve"> | UCLA Extension, Los Angeles, CA</w:t>
       </w:r>
     </w:p>
     <w:sectPr>
       <w:pgSz w:w="12240" w:h="15840" w:orient="portrait"/>
-      <w:pgMar w:top="863" w:right="1008" w:bottom="863" w:left="1008" w:header="708" w:footer="708" w:gutter="0"/>
+      <w:pgMar w:top="863" w:right="863" w:bottom="863" w:left="863" w:header="708" w:footer="708" w:gutter="0"/>
       <w:pgNumType/>
       <w:docGrid w:linePitch="360"/>
     </w:sectPr>

</xml_diff>

<commit_message>
Keep whole job entries on one page
A job block (header plus all bullets) now moves to the next page as a
unit instead of splitting; docx chains bullets with keepNext.

Co-Authored-By: Claude Fable 5 <noreply@anthropic.com>
Claude-Session: https://claude.ai/code/session_0169jAMuBb2MVYdrJVQdr8P2
</commit_message>
<xml_diff>
--- a/tailored/ODonnell_Andrew_Resume_Hoag_CRC.docx
+++ b/tailored/ODonnell_Andrew_Resume_Hoag_CRC.docx
@@ -241,6 +241,7 @@
     <w:p>
       <w:pPr>
         <w:pStyle w:val="ListParagraph"/>
+        <w:keepNext/>
         <w:numPr>
           <w:ilvl w:val="0"/>
           <w:numId w:val="2"/>
@@ -261,6 +262,7 @@
     <w:p>
       <w:pPr>
         <w:pStyle w:val="ListParagraph"/>
+        <w:keepNext/>
         <w:numPr>
           <w:ilvl w:val="0"/>
           <w:numId w:val="2"/>
@@ -281,6 +283,7 @@
     <w:p>
       <w:pPr>
         <w:pStyle w:val="ListParagraph"/>
+        <w:keepNext/>
         <w:numPr>
           <w:ilvl w:val="0"/>
           <w:numId w:val="2"/>
@@ -301,6 +304,7 @@
     <w:p>
       <w:pPr>
         <w:pStyle w:val="ListParagraph"/>
+        <w:keepNext/>
         <w:numPr>
           <w:ilvl w:val="0"/>
           <w:numId w:val="2"/>
@@ -321,6 +325,7 @@
     <w:p>
       <w:pPr>
         <w:pStyle w:val="ListParagraph"/>
+        <w:keepNext/>
         <w:numPr>
           <w:ilvl w:val="0"/>
           <w:numId w:val="2"/>
@@ -341,6 +346,7 @@
     <w:p>
       <w:pPr>
         <w:pStyle w:val="ListParagraph"/>
+        <w:keepNext w:val="false"/>
         <w:numPr>
           <w:ilvl w:val="0"/>
           <w:numId w:val="2"/>
@@ -387,6 +393,7 @@
     <w:p>
       <w:pPr>
         <w:pStyle w:val="ListParagraph"/>
+        <w:keepNext/>
         <w:numPr>
           <w:ilvl w:val="0"/>
           <w:numId w:val="2"/>
@@ -407,6 +414,7 @@
     <w:p>
       <w:pPr>
         <w:pStyle w:val="ListParagraph"/>
+        <w:keepNext/>
         <w:numPr>
           <w:ilvl w:val="0"/>
           <w:numId w:val="2"/>
@@ -427,6 +435,7 @@
     <w:p>
       <w:pPr>
         <w:pStyle w:val="ListParagraph"/>
+        <w:keepNext w:val="false"/>
         <w:numPr>
           <w:ilvl w:val="0"/>
           <w:numId w:val="2"/>
@@ -473,6 +482,7 @@
     <w:p>
       <w:pPr>
         <w:pStyle w:val="ListParagraph"/>
+        <w:keepNext/>
         <w:numPr>
           <w:ilvl w:val="0"/>
           <w:numId w:val="2"/>
@@ -493,6 +503,7 @@
     <w:p>
       <w:pPr>
         <w:pStyle w:val="ListParagraph"/>
+        <w:keepNext/>
         <w:numPr>
           <w:ilvl w:val="0"/>
           <w:numId w:val="2"/>
@@ -513,6 +524,7 @@
     <w:p>
       <w:pPr>
         <w:pStyle w:val="ListParagraph"/>
+        <w:keepNext/>
         <w:numPr>
           <w:ilvl w:val="0"/>
           <w:numId w:val="2"/>
@@ -533,6 +545,7 @@
     <w:p>
       <w:pPr>
         <w:pStyle w:val="ListParagraph"/>
+        <w:keepNext/>
         <w:numPr>
           <w:ilvl w:val="0"/>
           <w:numId w:val="2"/>
@@ -553,6 +566,7 @@
     <w:p>
       <w:pPr>
         <w:pStyle w:val="ListParagraph"/>
+        <w:keepNext w:val="false"/>
         <w:numPr>
           <w:ilvl w:val="0"/>
           <w:numId w:val="2"/>
@@ -599,6 +613,7 @@
     <w:p>
       <w:pPr>
         <w:pStyle w:val="ListParagraph"/>
+        <w:keepNext/>
         <w:numPr>
           <w:ilvl w:val="0"/>
           <w:numId w:val="2"/>
@@ -619,6 +634,7 @@
     <w:p>
       <w:pPr>
         <w:pStyle w:val="ListParagraph"/>
+        <w:keepNext/>
         <w:numPr>
           <w:ilvl w:val="0"/>
           <w:numId w:val="2"/>
@@ -639,6 +655,7 @@
     <w:p>
       <w:pPr>
         <w:pStyle w:val="ListParagraph"/>
+        <w:keepNext w:val="false"/>
         <w:numPr>
           <w:ilvl w:val="0"/>
           <w:numId w:val="2"/>
@@ -678,6 +695,7 @@
     <w:p>
       <w:pPr>
         <w:pStyle w:val="ListParagraph"/>
+        <w:keepNext/>
         <w:numPr>
           <w:ilvl w:val="0"/>
           <w:numId w:val="2"/>
@@ -698,6 +716,7 @@
     <w:p>
       <w:pPr>
         <w:pStyle w:val="ListParagraph"/>
+        <w:keepNext/>
         <w:numPr>
           <w:ilvl w:val="0"/>
           <w:numId w:val="2"/>
@@ -718,6 +737,7 @@
     <w:p>
       <w:pPr>
         <w:pStyle w:val="ListParagraph"/>
+        <w:keepNext/>
         <w:numPr>
           <w:ilvl w:val="0"/>
           <w:numId w:val="2"/>
@@ -738,6 +758,7 @@
     <w:p>
       <w:pPr>
         <w:pStyle w:val="ListParagraph"/>
+        <w:keepNext/>
         <w:numPr>
           <w:ilvl w:val="0"/>
           <w:numId w:val="2"/>
@@ -758,6 +779,7 @@
     <w:p>
       <w:pPr>
         <w:pStyle w:val="ListParagraph"/>
+        <w:keepNext/>
         <w:numPr>
           <w:ilvl w:val="0"/>
           <w:numId w:val="2"/>
@@ -778,6 +800,7 @@
     <w:p>
       <w:pPr>
         <w:pStyle w:val="ListParagraph"/>
+        <w:keepNext w:val="false"/>
         <w:numPr>
           <w:ilvl w:val="0"/>
           <w:numId w:val="2"/>
@@ -817,6 +840,7 @@
     <w:p>
       <w:pPr>
         <w:pStyle w:val="ListParagraph"/>
+        <w:keepNext/>
         <w:numPr>
           <w:ilvl w:val="0"/>
           <w:numId w:val="2"/>
@@ -837,6 +861,7 @@
     <w:p>
       <w:pPr>
         <w:pStyle w:val="ListParagraph"/>
+        <w:keepNext/>
         <w:numPr>
           <w:ilvl w:val="0"/>
           <w:numId w:val="2"/>
@@ -857,6 +882,7 @@
     <w:p>
       <w:pPr>
         <w:pStyle w:val="ListParagraph"/>
+        <w:keepNext/>
         <w:numPr>
           <w:ilvl w:val="0"/>
           <w:numId w:val="2"/>
@@ -877,6 +903,7 @@
     <w:p>
       <w:pPr>
         <w:pStyle w:val="ListParagraph"/>
+        <w:keepNext w:val="false"/>
         <w:numPr>
           <w:ilvl w:val="0"/>
           <w:numId w:val="2"/>

</xml_diff>

<commit_message>
Match master visual weight: black ink, larger type, thick section rules
Co-Authored-By: Claude Fable 5 <noreply@anthropic.com>
Claude-Session: https://claude.ai/code/session_0169jAMuBb2MVYdrJVQdr8P2
</commit_message>
<xml_diff>
--- a/tailored/ODonnell_Andrew_Resume_Hoag_CRC.docx
+++ b/tailored/ODonnell_Andrew_Resume_Hoag_CRC.docx
@@ -69,7 +69,7 @@
       <w:pPr>
         <w:keepNext/>
         <w:pBdr>
-          <w:bottom w:val="single" w:color="444444" w:sz="6"/>
+          <w:bottom w:val="single" w:color="000000" w:sz="14"/>
         </w:pBdr>
         <w:spacing w:after="80" w:before="200"/>
       </w:pPr>
@@ -103,7 +103,7 @@
       <w:pPr>
         <w:keepNext/>
         <w:pBdr>
-          <w:bottom w:val="single" w:color="444444" w:sz="6"/>
+          <w:bottom w:val="single" w:color="000000" w:sz="14"/>
         </w:pBdr>
         <w:spacing w:after="80" w:before="200"/>
       </w:pPr>
@@ -197,7 +197,7 @@
       <w:pPr>
         <w:keepNext/>
         <w:pBdr>
-          <w:bottom w:val="single" w:color="444444" w:sz="6"/>
+          <w:bottom w:val="single" w:color="000000" w:sz="14"/>
         </w:pBdr>
         <w:spacing w:after="80" w:before="200"/>
       </w:pPr>
@@ -677,7 +677,7 @@
       <w:pPr>
         <w:keepNext/>
         <w:pBdr>
-          <w:bottom w:val="single" w:color="444444" w:sz="6"/>
+          <w:bottom w:val="single" w:color="000000" w:sz="14"/>
         </w:pBdr>
         <w:spacing w:after="80" w:before="200"/>
       </w:pPr>
@@ -822,7 +822,7 @@
       <w:pPr>
         <w:keepNext/>
         <w:pBdr>
-          <w:bottom w:val="single" w:color="444444" w:sz="6"/>
+          <w:bottom w:val="single" w:color="000000" w:sz="14"/>
         </w:pBdr>
         <w:spacing w:after="80" w:before="200"/>
       </w:pPr>
@@ -925,7 +925,7 @@
       <w:pPr>
         <w:keepNext/>
         <w:pBdr>
-          <w:bottom w:val="single" w:color="444444" w:sz="6"/>
+          <w:bottom w:val="single" w:color="000000" w:sz="14"/>
         </w:pBdr>
         <w:spacing w:after="80" w:before="200"/>
       </w:pPr>

</xml_diff>